<commit_message>
updated with removal of --
</commit_message>
<xml_diff>
--- a/JobSeam-3-Day-Pitch-Launch-Plan.docx
+++ b/JobSeam-3-Day-Pitch-Launch-Plan.docx
@@ -381,7 +381,7 @@
           <w:sz w:val="19"/>
           <w:szCs w:val="19"/>
         </w:rPr>
-        <w:t xml:space="preserve">  —  e.g. jobseam.io, jobseam.ai, or jobseam.com — check availability first</w:t>
+        <w:t xml:space="preserve">  —  DONE — jobseam.com is registered and ready. Confirm it shows as Active in the Cloudflare dashboard before moving to DNS setup below.</w:t>
       </w:r>
     </w:p>
     <w:p>
@@ -399,7 +399,7 @@
           <w:sz w:val="19"/>
           <w:szCs w:val="19"/>
         </w:rPr>
-        <w:t xml:space="preserve">Registrar: Namecheap, Google Domains successor (Squarespace), or Cloudflare — all support free DNS management</w:t>
+        <w:t xml:space="preserve">Registrar: Cloudflare Registrar (already selected) — DNS records are managed directly in the Cloudflare dashboard, no separate DNS provider needed</w:t>
       </w:r>
     </w:p>
     <w:p>
@@ -428,7 +428,7 @@
           <w:sz w:val="19"/>
           <w:szCs w:val="19"/>
         </w:rPr>
-        <w:t xml:space="preserve">  —  CNAME file in repo root + DNS A/CNAME records at registrar</w:t>
+        <w:t xml:space="preserve">  —  CNAME file in repo root, plus A records and a www CNAME set inside Cloudflare DNS, since jobseam.com is an apex domain</w:t>
       </w:r>
     </w:p>
     <w:p>
@@ -446,7 +446,7 @@
           <w:sz w:val="19"/>
           <w:szCs w:val="19"/>
         </w:rPr>
-        <w:t xml:space="preserve">Repo → Settings → Pages → Custom domain field → enter jobseam.io → Save</w:t>
+        <w:t xml:space="preserve">Repo → Settings → Pages → Custom domain field → enter jobseam.com → Save</w:t>
       </w:r>
     </w:p>
     <w:p>
@@ -464,7 +464,7 @@
           <w:sz w:val="19"/>
           <w:szCs w:val="19"/>
         </w:rPr>
-        <w:t xml:space="preserve">At registrar: add CNAME record pointing to quezaal.github.io (or A records to GitHub's IPs if using apex domain)</w:t>
+        <w:t xml:space="preserve">In Cloudflare DNS: add four A records for the apex (jobseam.com) pointing to GitHub Pages' IP addresses — 185.199.108.153, 185.199.109.153, 185.199.110.153, 185.199.111.153 — plus a CNAME record for www pointing to quezaal.github.io. Set these to DNS only (grey cloud), not Proxied, until GitHub's HTTPS certificate is confirmed issued, since Cloudflare's proxy can interfere with that first certificate check.</w:t>
       </w:r>
     </w:p>
     <w:p>
@@ -482,7 +482,7 @@
           <w:sz w:val="19"/>
           <w:szCs w:val="19"/>
         </w:rPr>
-        <w:t xml:space="preserve">Enable 'Enforce HTTPS' once DNS propagates (can take up to a few hours)</w:t>
+        <w:t xml:space="preserve">Enable 'Enforce HTTPS' in the GitHub Pages settings once DNS propagates (can take up to a few hours). Only switch the Cloudflare records to Proxied (orange cloud) after HTTPS is confirmed working on jobseam.com.</w:t>
       </w:r>
     </w:p>
     <w:p>
@@ -558,7 +558,7 @@
           <w:sz w:val="19"/>
           <w:szCs w:val="19"/>
         </w:rPr>
-        <w:t xml:space="preserve">  —  currently a dead click — this is the #1 fix</w:t>
+        <w:t xml:space="preserve">  —  DONE — now points to https://calendly.com/connect-quezaal/20min</w:t>
       </w:r>
     </w:p>
     <w:p>
@@ -576,7 +576,7 @@
           <w:sz w:val="19"/>
           <w:szCs w:val="19"/>
         </w:rPr>
-        <w:t xml:space="preserve">Create a free Calendly (or similar) link with a 20–30 min slot</w:t>
+        <w:t xml:space="preserve">Calendly link created and live: https://calendly.com/connect-quezaal/20min (20-min slot)</w:t>
       </w:r>
     </w:p>
     <w:p>
@@ -594,7 +594,7 @@
           <w:sz w:val="19"/>
           <w:szCs w:val="19"/>
         </w:rPr>
-        <w:t xml:space="preserve">Add href to all 'Book a Demo' / 'Book a demo' buttons across index.html, onepager, deck</w:t>
+        <w:t xml:space="preserve">Calendly link wired into jobseam-onepager.html (both hero and footer CTA buttons) and jobseam-video.html (main CTA). index.html and jobseam-deck.html do not have Book a Demo buttons directly, they link out to the onepager and video page instead.</w:t>
       </w:r>
     </w:p>
     <w:p>
@@ -1237,7 +1237,7 @@
           <w:sz w:val="21"/>
           <w:szCs w:val="21"/>
         </w:rPr>
-        <w:t xml:space="preserve">Publish one LinkedIn post today</w:t>
+        <w:t xml:space="preserve">Publish one LinkedIn post today, built around the YouTube video above (native LinkedIn video upload, YouTube link in the first comment)</w:t>
       </w:r>
       <w:r>
         <w:rPr>
@@ -1400,7 +1400,7 @@
           <w:sz w:val="19"/>
           <w:szCs w:val="19"/>
         </w:rPr>
-        <w:t xml:space="preserve">  —  jobseam-video.html has an existing walkthrough script if you need a script to follow</w:t>
+        <w:t xml:space="preserve">  —  DONE — Video 1 is recorded, uploaded, and live on YouTube: https://www.youtube.com/watch?v=kHdo0Fq-0WM. This is the content to publish today, not a new script. Upload it natively to LinkedIn as well rather than just pasting the YouTube link, native uploads get more organic reach there.</w:t>
       </w:r>
     </w:p>
     <w:p>
@@ -1737,7 +1737,7 @@
           <w:sz w:val="21"/>
           <w:szCs w:val="21"/>
         </w:rPr>
-        <w:t xml:space="preserve">Confirm the Calendly link and contact link both work</w:t>
+        <w:t xml:space="preserve">Confirm the Calendly link and the demo@quezaal.com mailto link both work by clicking through from the live jobseam.com site, not just the local files</w:t>
       </w:r>
       <w:r>
         <w:t xml:space="preserve"/>

</xml_diff>